<commit_message>
polished code and code structure -> make it run
</commit_message>
<xml_diff>
--- a/SK4_F5_BikeFlow.docx
+++ b/SK4_F5_BikeFlow.docx
@@ -2372,7 +2372,7 @@
           <w:sz w:val="22"/>
           <w:szCs w:val="22"/>
         </w:rPr>
-        <w:t xml:space="preserve">RentalService.startRental(), RentalService.finishRental() (Control) – riadia životný cyklus prenájmu: PRE_REGISTERED → ACTIVE → FINISHED</w:t>
+        <w:t>RentalService.startRental(), RentalService.finishRental() (Control) – riadia životný cyklus prenájmu: PRELIMINARY → ACTIVE → COMPLETED</w:t>
       </w:r>
     </w:p>
     <w:p>
@@ -3079,7 +3079,7 @@
           <w:sz w:val="22"/>
           <w:szCs w:val="22"/>
         </w:rPr>
-        <w:t xml:space="preserve">Schéma je vytváraná automaticky cez Hibernate (ddl-auto=create-drop). Flyway je vypnuté (spring.flyway.enabled=false). Seed dáta sú načítané zo súboru data.sql pri každom štarte (spring.sql.init.mode=always).</w:t>
+        <w:t>Schéma je vytváraná automaticky cez Hibernate (ddl-auto=create-drop). Flyway je vypnuté (spring.flyway.enabled=false). Seed dáta sú načítané zo súboru data.sql pri každom štarte (spring.sql.init.mode=always). Súbor obsahuje testovací zákazníkov, prevádzky, bicykle, servisné rezervácie (vrátane poľa loyalty_discount_percent s NOT NULL constr.), produkty, sklad a náhradné diely.</w:t>
       </w:r>
     </w:p>
     <w:p>
@@ -3264,7 +3264,7 @@
           <w:sz w:val="22"/>
           <w:szCs w:val="22"/>
         </w:rPr>
-        <w:t xml:space="preserve">Triedy RentalServiceTest a ServiceBookingServiceTest overujú kľúčovú biznis logiku UC01–UC06 pomocou Mockito mockov.</w:t>
+        <w:t>Triedy RentalServiceTest a ServiceBookingServiceTest overujú kľúčovú biznis logiku UC01–UC06 pomocou Mockito mockov. RentalServiceTest pokrýva pre-registráciu, zrušenie prenajmu (bez refundu kreditu) a chybný stav. ServiceBookingServiceTest pokrýva vytvorenie rezervácie a spracovanie opravy s výpočtom ceny a loyalty zľavou.</w:t>
       </w:r>
     </w:p>
     <w:p>

</xml_diff>

<commit_message>
fixed UC03 API, small add for UC05, audit
</commit_message>
<xml_diff>
--- a/SK4_F5_BikeFlow.docx
+++ b/SK4_F5_BikeFlow.docx
@@ -5658,7 +5658,7 @@
       </w:pPr>
       <w:proofErr w:type="spellStart"/>
       <w:r>
-        <w:t>ExpeditionRequestService.create</w:t>
+        <w:t>ExpeditionRequestService.create() (Control) – validuje dostupnosť zásob v zdrojovej prevádzke (UC03b), overuje, že zdrojová a cieľová prevádzka sú rôzne; po vytvorení požiadavky odpočíta expedované množstvo zo skladu zdrojovej prevádzky</w:t>
       </w:r>
       <w:proofErr w:type="spellEnd"/>
       <w:r>
@@ -5763,7 +5763,7 @@
     <w:p/>
     <w:p>
       <w:r>
-        <w:t xml:space="preserve">Kľúčová metóda: </w:t>
+        <w:t>Kľúčová metóda: ExpeditionRequestService.create() realizuje kroky 9–17 hlavného scenára UC03, vrátane kontroly dostupnosti (UC03b) a odpočítania zásoby. InventoryController.getOverview() vracia stav skladu vrátane minimálneho množstva (minimumQuantity) a príznaku podstavu (belowMinimum).</w:t>
       </w:r>
       <w:proofErr w:type="spellStart"/>
       <w:r>
@@ -7271,152 +7271,80 @@
     </w:p>
     <w:p>
       <w:r>
-        <w:t xml:space="preserve">Schéma je vytváraná automaticky cez </w:t>
-      </w:r>
-      <w:proofErr w:type="spellStart"/>
-      <w:r>
-        <w:t>Hibernate</w:t>
-      </w:r>
-      <w:proofErr w:type="spellEnd"/>
-      <w:r>
-        <w:t xml:space="preserve"> (</w:t>
-      </w:r>
-      <w:proofErr w:type="spellStart"/>
-      <w:r>
-        <w:t>ddl</w:t>
-      </w:r>
-      <w:proofErr w:type="spellEnd"/>
-      <w:r>
-        <w:t>-auto=</w:t>
-      </w:r>
-      <w:proofErr w:type="spellStart"/>
-      <w:r>
-        <w:t>create</w:t>
-      </w:r>
-      <w:proofErr w:type="spellEnd"/>
-      <w:r>
-        <w:t xml:space="preserve">-drop). </w:t>
-      </w:r>
-      <w:proofErr w:type="spellStart"/>
-      <w:r>
-        <w:t>Flyway</w:t>
-      </w:r>
-      <w:proofErr w:type="spellEnd"/>
-      <w:r>
-        <w:t xml:space="preserve"> je vypnuté (</w:t>
-      </w:r>
-      <w:proofErr w:type="spellStart"/>
-      <w:r>
-        <w:t>spring.flyway.enabled</w:t>
-      </w:r>
-      <w:proofErr w:type="spellEnd"/>
-      <w:r>
-        <w:t>=</w:t>
-      </w:r>
-      <w:proofErr w:type="spellStart"/>
-      <w:r>
-        <w:t>false</w:t>
-      </w:r>
-      <w:proofErr w:type="spellEnd"/>
-      <w:r>
-        <w:t xml:space="preserve">). Aplikácia používa vstavanú </w:t>
-      </w:r>
-      <w:proofErr w:type="spellStart"/>
-      <w:r>
-        <w:t>H2</w:t>
-      </w:r>
-      <w:proofErr w:type="spellEnd"/>
-      <w:r>
-        <w:t xml:space="preserve"> in-</w:t>
-      </w:r>
-      <w:proofErr w:type="spellStart"/>
-      <w:r>
-        <w:t>memory</w:t>
-      </w:r>
-      <w:proofErr w:type="spellEnd"/>
-      <w:r>
-        <w:t xml:space="preserve"> databázu – </w:t>
-      </w:r>
-      <w:proofErr w:type="spellStart"/>
-      <w:r>
-        <w:t>PostgreSQL</w:t>
-      </w:r>
-      <w:proofErr w:type="spellEnd"/>
-      <w:r>
-        <w:t xml:space="preserve"> nie je potrebný. </w:t>
-      </w:r>
-      <w:proofErr w:type="spellStart"/>
-      <w:r>
-        <w:t>Seed</w:t>
-      </w:r>
-      <w:proofErr w:type="spellEnd"/>
-      <w:r>
-        <w:t xml:space="preserve"> dáta sú načítané zo súboru </w:t>
-      </w:r>
-      <w:proofErr w:type="spellStart"/>
-      <w:r>
-        <w:t>data.sql</w:t>
-      </w:r>
-      <w:proofErr w:type="spellEnd"/>
-      <w:r>
-        <w:t xml:space="preserve"> pri každom štarte (</w:t>
-      </w:r>
-      <w:proofErr w:type="spellStart"/>
-      <w:r>
-        <w:t>spring.sql.init.mode</w:t>
-      </w:r>
-      <w:proofErr w:type="spellEnd"/>
-      <w:r>
-        <w:t>=</w:t>
-      </w:r>
-      <w:proofErr w:type="spellStart"/>
-      <w:r>
-        <w:t>always</w:t>
-      </w:r>
-      <w:proofErr w:type="spellEnd"/>
-      <w:r>
-        <w:t xml:space="preserve">). </w:t>
-      </w:r>
-      <w:proofErr w:type="spellStart"/>
-      <w:r>
-        <w:t>H2</w:t>
-      </w:r>
-      <w:proofErr w:type="spellEnd"/>
-      <w:r>
-        <w:t xml:space="preserve"> konzola je dostupná na /</w:t>
-      </w:r>
-      <w:proofErr w:type="spellStart"/>
-      <w:r>
-        <w:t>h2-console</w:t>
-      </w:r>
-      <w:proofErr w:type="spellEnd"/>
-      <w:r>
-        <w:t xml:space="preserve"> (</w:t>
-      </w:r>
-      <w:proofErr w:type="spellStart"/>
-      <w:r>
-        <w:t>JDBC</w:t>
-      </w:r>
-      <w:proofErr w:type="spellEnd"/>
-      <w:r>
-        <w:t xml:space="preserve"> </w:t>
-      </w:r>
-      <w:proofErr w:type="spellStart"/>
-      <w:r>
-        <w:t>URL</w:t>
-      </w:r>
-      <w:proofErr w:type="spellEnd"/>
-      <w:r>
-        <w:t xml:space="preserve">: </w:t>
-      </w:r>
-      <w:proofErr w:type="spellStart"/>
-      <w:r>
-        <w:t>jdbc:h2:mem:bikeflow</w:t>
-      </w:r>
-      <w:proofErr w:type="spellEnd"/>
-      <w:r>
-        <w:t>, user: sa).</w:t>
-      </w:r>
+        <w:t>Schéma je vytváraná automaticky cez Hibernate (ddl-auto=create-drop). Flyway je vypnuté (spring.flyway.enabled=false). Aplikácia používa vstavanú H2 in-memory databázu – PostgreSQL nie je potrebný. Seed dáta sú načítané zo súboru data.sql pri každom štarte (spring.sql.init.mode=always). H2 konzola je dostupná na /h2-console (JDBC URL: jdbc:h2:mem:bikeflow, user: sa). Seed data obsahuju aj zaznamy service_worker (Marek Novak, Jana Kovacova) a warehouse_staff (Peter Skladnik) pre testovanie vazby na prevadzky.</w:t>
+      </w:r>
+      <w:proofErr w:type="spellStart"/>
+      <w:r/>
+      <w:proofErr w:type="spellEnd"/>
+      <w:r/>
+      <w:proofErr w:type="spellStart"/>
+      <w:r/>
+      <w:proofErr w:type="spellEnd"/>
+      <w:r/>
+      <w:proofErr w:type="spellStart"/>
+      <w:r/>
+      <w:proofErr w:type="spellEnd"/>
+      <w:r/>
+      <w:proofErr w:type="spellStart"/>
+      <w:r/>
+      <w:proofErr w:type="spellEnd"/>
+      <w:r/>
+      <w:proofErr w:type="spellStart"/>
+      <w:r/>
+      <w:proofErr w:type="spellEnd"/>
+      <w:r/>
+      <w:proofErr w:type="spellStart"/>
+      <w:r/>
+      <w:proofErr w:type="spellEnd"/>
+      <w:r/>
+      <w:proofErr w:type="spellStart"/>
+      <w:r/>
+      <w:proofErr w:type="spellEnd"/>
+      <w:r/>
+      <w:proofErr w:type="spellStart"/>
+      <w:r/>
+      <w:proofErr w:type="spellEnd"/>
+      <w:r/>
+      <w:proofErr w:type="spellStart"/>
+      <w:r/>
+      <w:proofErr w:type="spellEnd"/>
+      <w:r/>
+      <w:proofErr w:type="spellStart"/>
+      <w:r/>
+      <w:proofErr w:type="spellEnd"/>
+      <w:r/>
+      <w:proofErr w:type="spellStart"/>
+      <w:r/>
+      <w:proofErr w:type="spellEnd"/>
+      <w:r/>
+      <w:proofErr w:type="spellStart"/>
+      <w:r/>
+      <w:proofErr w:type="spellEnd"/>
+      <w:r/>
+      <w:proofErr w:type="spellStart"/>
+      <w:r/>
+      <w:proofErr w:type="spellEnd"/>
+      <w:r/>
+      <w:proofErr w:type="spellStart"/>
+      <w:r/>
+      <w:proofErr w:type="spellEnd"/>
+      <w:r/>
+      <w:proofErr w:type="spellStart"/>
+      <w:r/>
+      <w:proofErr w:type="spellEnd"/>
+      <w:r/>
+      <w:proofErr w:type="spellStart"/>
+      <w:r/>
+      <w:proofErr w:type="spellEnd"/>
+      <w:r/>
+      <w:proofErr w:type="spellStart"/>
+      <w:r/>
+      <w:proofErr w:type="spellEnd"/>
+      <w:r/>
+      <w:proofErr w:type="spellStart"/>
+      <w:r/>
+      <w:proofErr w:type="spellEnd"/>
+      <w:r/>
     </w:p>
     <w:p>
       <w:pPr>
@@ -7741,112 +7669,60 @@
     </w:p>
     <w:p>
       <w:r>
-        <w:t>Implementácia pokrýva šesť hlavných prípadov použitia (</w:t>
-      </w:r>
-      <w:proofErr w:type="spellStart"/>
-      <w:r>
-        <w:t>UC01</w:t>
-      </w:r>
-      <w:proofErr w:type="spellEnd"/>
-      <w:r>
-        <w:t>–</w:t>
-      </w:r>
-      <w:proofErr w:type="spellStart"/>
-      <w:r>
-        <w:t>UC06</w:t>
-      </w:r>
-      <w:proofErr w:type="spellEnd"/>
-      <w:r>
-        <w:t xml:space="preserve">) definovaných v predchádzajúcich fázach. Kód je organizovaný podľa </w:t>
-      </w:r>
-      <w:proofErr w:type="spellStart"/>
-      <w:r>
-        <w:t>BCE</w:t>
-      </w:r>
-      <w:proofErr w:type="spellEnd"/>
-      <w:r>
-        <w:t xml:space="preserve"> architektonického vzoru s jasným oddelením </w:t>
-      </w:r>
-      <w:proofErr w:type="spellStart"/>
-      <w:r>
-        <w:t>Boundary</w:t>
-      </w:r>
-      <w:proofErr w:type="spellEnd"/>
-      <w:r>
-        <w:t xml:space="preserve"> (REST </w:t>
-      </w:r>
-      <w:proofErr w:type="spellStart"/>
-      <w:r>
-        <w:t>controllery</w:t>
-      </w:r>
-      <w:proofErr w:type="spellEnd"/>
-      <w:r>
-        <w:t xml:space="preserve"> + </w:t>
-      </w:r>
-      <w:proofErr w:type="spellStart"/>
-      <w:r>
-        <w:t>UI</w:t>
-      </w:r>
-      <w:proofErr w:type="spellEnd"/>
-      <w:r>
-        <w:t xml:space="preserve">), </w:t>
-      </w:r>
-      <w:proofErr w:type="spellStart"/>
-      <w:r>
-        <w:t>Control</w:t>
-      </w:r>
-      <w:proofErr w:type="spellEnd"/>
-      <w:r>
-        <w:t xml:space="preserve"> (</w:t>
-      </w:r>
-      <w:proofErr w:type="spellStart"/>
-      <w:r>
-        <w:t>Spring</w:t>
-      </w:r>
-      <w:proofErr w:type="spellEnd"/>
-      <w:r>
-        <w:t xml:space="preserve"> @Service triedy) a Entity (</w:t>
-      </w:r>
-      <w:proofErr w:type="spellStart"/>
-      <w:r>
-        <w:t>JPA</w:t>
-      </w:r>
-      <w:proofErr w:type="spellEnd"/>
-      <w:r>
-        <w:t xml:space="preserve"> doménové triedy) vrstiev. Nové triedy pridané v tejto fáze (</w:t>
-      </w:r>
-      <w:proofErr w:type="spellStart"/>
-      <w:r>
-        <w:t>Cancellable</w:t>
-      </w:r>
-      <w:proofErr w:type="spellEnd"/>
-      <w:r>
-        <w:t xml:space="preserve">, </w:t>
-      </w:r>
-      <w:proofErr w:type="spellStart"/>
-      <w:r>
-        <w:t>Notifiable</w:t>
-      </w:r>
-      <w:proofErr w:type="spellEnd"/>
-      <w:r>
-        <w:t xml:space="preserve">, Feedback) priamo zodpovedajú triedam navrhnutým v </w:t>
-      </w:r>
-      <w:proofErr w:type="spellStart"/>
-      <w:r>
-        <w:t>F4</w:t>
-      </w:r>
-      <w:proofErr w:type="spellEnd"/>
-      <w:r>
-        <w:t xml:space="preserve"> </w:t>
-      </w:r>
-      <w:proofErr w:type="spellStart"/>
-      <w:r>
-        <w:t>class</w:t>
-      </w:r>
-      <w:proofErr w:type="spellEnd"/>
-      <w:r>
-        <w:t xml:space="preserve"> diagramoch, čím sa uzatvára konzistencia medzi návrhovým modelom a implementáciou.</w:t>
-      </w:r>
+        <w:t>Implementácia pokrýva šesť hlavných prípadov použitia (UC01–UC06) definovaných v predchádzajúcich fázach. Kód je organizovaný podľa BCE architektonického vzoru s jasným oddelením Boundary (REST controllery + UI), Control (Spring @Service triedy) a Entity (JPA doménové triedy) vrstiev. Nové triedy pridané v tejto fáze (Cancellable, Notifiable, Feedback) priamo zodpovedajú triedam navrhnutým v F4 class diagramoch, čím sa uzatvára konzistencia medzi návrhovým modelom a implementáciou. Globalny audit (UI-R11) potvrdil uplnost implementacie: doplnene feedback UI pre UC05 v statickom rozhrani a seed data pre service_worker a warehouse_staff entity.</w:t>
+      </w:r>
+      <w:proofErr w:type="spellStart"/>
+      <w:r/>
+      <w:proofErr w:type="spellEnd"/>
+      <w:r/>
+      <w:proofErr w:type="spellStart"/>
+      <w:r/>
+      <w:proofErr w:type="spellEnd"/>
+      <w:r/>
+      <w:proofErr w:type="spellStart"/>
+      <w:r/>
+      <w:proofErr w:type="spellEnd"/>
+      <w:r/>
+      <w:proofErr w:type="spellStart"/>
+      <w:r/>
+      <w:proofErr w:type="spellEnd"/>
+      <w:r/>
+      <w:proofErr w:type="spellStart"/>
+      <w:r/>
+      <w:proofErr w:type="spellEnd"/>
+      <w:r/>
+      <w:proofErr w:type="spellStart"/>
+      <w:r/>
+      <w:proofErr w:type="spellEnd"/>
+      <w:r/>
+      <w:proofErr w:type="spellStart"/>
+      <w:r/>
+      <w:proofErr w:type="spellEnd"/>
+      <w:r/>
+      <w:proofErr w:type="spellStart"/>
+      <w:r/>
+      <w:proofErr w:type="spellEnd"/>
+      <w:r/>
+      <w:proofErr w:type="spellStart"/>
+      <w:r/>
+      <w:proofErr w:type="spellEnd"/>
+      <w:r/>
+      <w:proofErr w:type="spellStart"/>
+      <w:r/>
+      <w:proofErr w:type="spellEnd"/>
+      <w:r/>
+      <w:proofErr w:type="spellStart"/>
+      <w:r/>
+      <w:proofErr w:type="spellEnd"/>
+      <w:r/>
+      <w:proofErr w:type="spellStart"/>
+      <w:r/>
+      <w:proofErr w:type="spellEnd"/>
+      <w:r/>
+      <w:proofErr w:type="spellStart"/>
+      <w:r/>
+      <w:proofErr w:type="spellEnd"/>
+      <w:r/>
     </w:p>
     <w:sectPr>
       <w:headerReference w:type="default" r:id="rId11"/>

</xml_diff>